<commit_message>
Let docx-screenshot upload options be typed OR screenshotted
Every option/stem was forced through a screenshot even for plain values
(e.g. "1.2 J"), which nudged mentors toward pasting one combined
question-image under multiple markers instead of cropping separately —
silently misattributing every option to the stem slot and skipping the
whole question. Now each Q<n>./A)/B)/C)/D) marker accepts typed text or a
screenshot (or both): type plain values directly, screenshot only what
actually has an equation or diagram. Updated the card copy and sample
template to match.

Co-Authored-By: Claude Sonnet 5 <noreply@anthropic.com>
</commit_message>
<xml_diff>
--- a/frontend/public/templates/docx-screenshot-questions-template.docx
+++ b/frontend/public/templates/docx-screenshot-questions-template.docx
@@ -15,7 +15,7 @@
         <w:spacing w:after="200"/>
       </w:pPr>
       <w:r>
-        <w:t xml:space="preserve">This document holds nothing but pasted screenshots — no typed question text, no answers, no marks. Everything is matched purely by position: a "Q&lt;number&gt;." line marks a new question, and an "A)"/"B)"/"C)"/"D)" line marks an option. Paste that item's screenshot on the very next line (pasting on the same line right after the marker also works). Answers, marks, chapter, etc. all come from the paired Excel mapping sheet, matched by the same question numbers.</w:t>
+        <w:t xml:space="preserve">Everything is matched purely by position: a "Q&lt;number&gt;." line marks a new question, and an "A)"/"B)"/"C)"/"D)" line marks an option. For each one, either type its value directly right after the marker (e.g. "A) 1.2 J") if it's plain text, or paste a screenshot on the next line (or the same line) if it's an equation or diagram — never both unless it genuinely needs both. Whatever you type is stored exactly as typed, never re-parsed, so there's no equation/font garbling risk for typed content either. Answers, marks, chapter, etc. all come from the paired Excel mapping sheet, matched by the same question numbers — never from anything typed here.</w:t>
       </w:r>
     </w:p>
     <w:p>
@@ -35,7 +35,7 @@
         <w:t xml:space="preserve">Q&lt;number&gt;.</w:t>
       </w:r>
       <w:r>
-        <w:t xml:space="preserve"> on its own line, then the stem/diagram screenshot on the next line.</w:t>
+        <w:t xml:space="preserve"> starts each question — type the stem directly if it's plain text, or paste a screenshot (same line or the next) if it has an equation/diagram.</w:t>
       </w:r>
     </w:p>
     <w:p>
@@ -50,7 +50,7 @@
         <w:t xml:space="preserve">A) B) C) D)</w:t>
       </w:r>
       <w:r>
-        <w:t xml:space="preserve"> each on their own line, each followed by that option's screenshot. Leave them out entirely for a numerical question — just the stem screenshot.</w:t>
+        <w:t xml:space="preserve"> each mark an option — type or paste, same rule as the stem. Leave them out entirely for a numerical question.</w:t>
       </w:r>
     </w:p>
     <w:p>
@@ -58,7 +58,7 @@
         <w:pStyle w:val="Heading2"/>
       </w:pPr>
       <w:r>
-        <w:t xml:space="preserve">Fill in below (delete this text first)</w:t>
+        <w:t xml:space="preserve">Example — mostly typed, one option screenshotted</w:t>
       </w:r>
     </w:p>
     <w:p>
@@ -75,58 +75,65 @@
     </w:p>
     <w:p>
       <w:r>
-        <w:t xml:space="preserve">[paste the stem/diagram screenshot here]</w:t>
-      </w:r>
-    </w:p>
-    <w:p>
+        <w:t xml:space="preserve">[paste the stem screenshot here — this question's equation doesn't type cleanly]</w:t>
+      </w:r>
+    </w:p>
+    <w:p>
+      <w:r>
+        <w:t xml:space="preserve">A) 1.2 J</w:t>
+      </w:r>
+    </w:p>
+    <w:p>
+      <w:r>
+        <w:t xml:space="preserve">B) 1.5 J</w:t>
+      </w:r>
+    </w:p>
+    <w:p>
+      <w:r>
+        <w:t xml:space="preserve">C) 0.8 J</w:t>
+      </w:r>
+    </w:p>
+    <w:p>
+      <w:pPr>
+        <w:spacing w:after="200"/>
+      </w:pPr>
+      <w:r>
+        <w:t xml:space="preserve">D) 1.0 J</w:t>
+      </w:r>
+    </w:p>
+    <w:p>
+      <w:pPr>
+        <w:pStyle w:val="Heading2"/>
+      </w:pPr>
+      <w:r>
+        <w:t xml:space="preserve">Example — fully typed, no screenshots needed</w:t>
+      </w:r>
+    </w:p>
+    <w:p>
+      <w:pPr>
+        <w:spacing w:before="200"/>
+      </w:pPr>
       <w:r>
         <w:rPr>
           <w:b/>
           <w:bCs/>
         </w:rPr>
-        <w:t xml:space="preserve">A)</w:t>
-      </w:r>
-    </w:p>
-    <w:p>
-      <w:r>
-        <w:t xml:space="preserve">[paste option A here]</w:t>
-      </w:r>
-    </w:p>
-    <w:p>
-      <w:r>
-        <w:rPr>
-          <w:b/>
-          <w:bCs/>
-        </w:rPr>
-        <w:t xml:space="preserve">B)</w:t>
-      </w:r>
-    </w:p>
-    <w:p>
-      <w:r>
-        <w:t xml:space="preserve">[paste option B here]</w:t>
-      </w:r>
-    </w:p>
-    <w:p>
-      <w:r>
-        <w:rPr>
-          <w:b/>
-          <w:bCs/>
-        </w:rPr>
-        <w:t xml:space="preserve">C)</w:t>
-      </w:r>
-    </w:p>
-    <w:p>
-      <w:r>
-        <w:t xml:space="preserve">[paste option C here]</w:t>
-      </w:r>
-    </w:p>
-    <w:p>
-      <w:r>
-        <w:rPr>
-          <w:b/>
-          <w:bCs/>
-        </w:rPr>
-        <w:t xml:space="preserve">D)</w:t>
+        <w:t xml:space="preserve">Q2. A ball is dropped from rest. What is its acceleration near Earth’s surface?</w:t>
+      </w:r>
+    </w:p>
+    <w:p>
+      <w:r>
+        <w:t xml:space="preserve">A) 0</w:t>
+      </w:r>
+    </w:p>
+    <w:p>
+      <w:r>
+        <w:t xml:space="preserve">B) 9.8</w:t>
+      </w:r>
+    </w:p>
+    <w:p>
+      <w:r>
+        <w:t xml:space="preserve">C) 4.9</w:t>
       </w:r>
     </w:p>
     <w:p>
@@ -134,21 +141,12 @@
         <w:spacing w:after="200"/>
       </w:pPr>
       <w:r>
-        <w:t xml:space="preserve">[paste option D here]</w:t>
-      </w:r>
-    </w:p>
-    <w:p>
-      <w:r>
-        <w:rPr>
-          <w:b/>
-          <w:bCs/>
-        </w:rPr>
-        <w:t xml:space="preserve">Q2.</w:t>
-      </w:r>
-    </w:p>
-    <w:p>
-      <w:r>
-        <w:t xml:space="preserve">[paste the next question's stem/diagram screenshot here — repeat the A)/B)/C)/D) pattern above, or omit them entirely for a numerical question]</w:t>
+        <w:t xml:space="preserve">D) 19.6</w:t>
+      </w:r>
+    </w:p>
+    <w:p>
+      <w:r>
+        <w:t xml:space="preserve">Delete these example questions and replace them with your own — keep the same Q&lt;number&gt;./A)/B)/C)/D) marker pattern.</w:t>
       </w:r>
     </w:p>
     <w:sectPr>

</xml_diff>

<commit_message>
Switch docx-screenshot option markers to [A]/[B]/[C]/[D] to dodge Word autocorrect
A typed "A)" at the start of a line gets silently converted by Word's
AutoFormat As You Type into an automatic numbered list the moment Enter is
pressed — the literal text disappears entirely, so every option's content
fell through to whatever context was still active (the stem), producing
"more than one image found" on the stem repeatedly and zero real options.
Square brackets aren't a pattern Word auto-converts, so they can't vanish.
The old A)/B)/... form is still accepted as a fallback. Updated the card
copy and sample template to the new format, with an explicit warning about
why.

Co-Authored-By: Claude Sonnet 5 <noreply@anthropic.com>
</commit_message>
<xml_diff>
--- a/frontend/public/templates/docx-screenshot-questions-template.docx
+++ b/frontend/public/templates/docx-screenshot-questions-template.docx
@@ -15,90 +15,57 @@
         <w:spacing w:after="200"/>
       </w:pPr>
       <w:r>
-        <w:t xml:space="preserve">Everything is matched purely by position: a "Q&lt;number&gt;." line marks a new question, and an "A)"/"B)"/"C)"/"D)" line marks an option. For each one, either type its value directly right after the marker (e.g. "A) 1.2 J") if it's plain text, or paste a screenshot on the next line (or the same line) if it's an equation or diagram — never both unless it genuinely needs both. Whatever you type is stored exactly as typed, never re-parsed, so there's no equation/font garbling risk for typed content either. Answers, marks, chapter, etc. all come from the paired Excel mapping sheet, matched by the same question numbers — never from anything typed here.</w:t>
-      </w:r>
-    </w:p>
-    <w:p>
-      <w:pPr>
-        <w:pStyle w:val="Heading2"/>
-      </w:pPr>
-      <w:r>
-        <w:t xml:space="preserve">Format</w:t>
-      </w:r>
-    </w:p>
-    <w:p>
+        <w:t xml:space="preserve">Everything is matched purely by position: a "Q&lt;number&gt;." line marks a new question, and an "[A]"/"[B]"/"[C]"/"[D]" line (square brackets) marks an option. For each one, either type its value directly right after the marker (e.g. "[A] 1.2 J") if it's plain text, or paste a screenshot on the next line (or the same line) if it's an equation or diagram — never both unless it genuinely needs both. Whatever you type is stored exactly as typed, never re-parsed, so there's no equation/font garbling risk for typed content either. Answers, marks, chapter, etc. all come from the paired Excel mapping sheet, matched by the same question numbers — never from anything typed here.</w:t>
+      </w:r>
+    </w:p>
+    <w:p>
+      <w:pPr>
+        <w:spacing w:after="200"/>
+      </w:pPr>
       <w:r>
         <w:rPr>
           <w:b/>
           <w:bCs/>
         </w:rPr>
-        <w:t xml:space="preserve">Q&lt;number&gt;.</w:t>
-      </w:r>
-      <w:r>
-        <w:t xml:space="preserve"> starts each question — type the stem directly if it's plain text, or paste a screenshot (same line or the next) if it has an equation/diagram.</w:t>
-      </w:r>
-    </w:p>
-    <w:p>
-      <w:pPr>
-        <w:spacing w:after="200"/>
-      </w:pPr>
+        <w:t xml:space="preserve">Use "[A]", not "A)". </w:t>
+      </w:r>
+      <w:r>
+        <w:t xml:space="preserve">Word's AutoCorrect silently turns a typed "A)" at the start of a line into an automatic numbered list the moment you press Enter — the literal "A)" text disappears entirely, and every option then silently collapses into the question stem. Square brackets aren't a pattern Word auto-converts, so they always stay exactly as typed.</w:t>
+      </w:r>
+    </w:p>
+    <w:p>
+      <w:pPr>
+        <w:pStyle w:val="Heading2"/>
+      </w:pPr>
+      <w:r>
+        <w:t xml:space="preserve">Format</w:t>
+      </w:r>
+    </w:p>
+    <w:p>
       <w:r>
         <w:rPr>
           <w:b/>
           <w:bCs/>
         </w:rPr>
-        <w:t xml:space="preserve">A) B) C) D)</w:t>
-      </w:r>
-      <w:r>
-        <w:t xml:space="preserve"> each mark an option — type or paste, same rule as the stem. Leave them out entirely for a numerical question.</w:t>
-      </w:r>
-    </w:p>
-    <w:p>
-      <w:pPr>
-        <w:pStyle w:val="Heading2"/>
-      </w:pPr>
-      <w:r>
-        <w:t xml:space="preserve">Example — mostly typed, one option screenshotted</w:t>
-      </w:r>
-    </w:p>
-    <w:p>
-      <w:pPr>
-        <w:spacing w:before="200"/>
+        <w:t xml:space="preserve">Q&lt;number&gt;.</w:t>
+      </w:r>
+      <w:r>
+        <w:t xml:space="preserve"> starts each question — type the stem directly if it's plain text, or paste a screenshot (same line or the next) if it has an equation/diagram.</w:t>
+      </w:r>
+    </w:p>
+    <w:p>
+      <w:pPr>
+        <w:spacing w:after="200"/>
       </w:pPr>
       <w:r>
         <w:rPr>
           <w:b/>
           <w:bCs/>
         </w:rPr>
-        <w:t xml:space="preserve">Q1.</w:t>
-      </w:r>
-    </w:p>
-    <w:p>
-      <w:r>
-        <w:t xml:space="preserve">[paste the stem screenshot here — this question's equation doesn't type cleanly]</w:t>
-      </w:r>
-    </w:p>
-    <w:p>
-      <w:r>
-        <w:t xml:space="preserve">A) 1.2 J</w:t>
-      </w:r>
-    </w:p>
-    <w:p>
-      <w:r>
-        <w:t xml:space="preserve">B) 1.5 J</w:t>
-      </w:r>
-    </w:p>
-    <w:p>
-      <w:r>
-        <w:t xml:space="preserve">C) 0.8 J</w:t>
-      </w:r>
-    </w:p>
-    <w:p>
-      <w:pPr>
-        <w:spacing w:after="200"/>
-      </w:pPr>
-      <w:r>
-        <w:t xml:space="preserve">D) 1.0 J</w:t>
+        <w:t xml:space="preserve">[A] [B] [C] [D]</w:t>
+      </w:r>
+      <w:r>
+        <w:t xml:space="preserve"> each mark an option — type or paste, same rule as the stem. Leave them out entirely for a numerical question.</w:t>
       </w:r>
     </w:p>
     <w:p>
@@ -106,7 +73,7 @@
         <w:pStyle w:val="Heading2"/>
       </w:pPr>
       <w:r>
-        <w:t xml:space="preserve">Example — fully typed, no screenshots needed</w:t>
+        <w:t xml:space="preserve">Example — mostly typed, one option screenshotted</w:t>
       </w:r>
     </w:p>
     <w:p>
@@ -118,22 +85,70 @@
           <w:b/>
           <w:bCs/>
         </w:rPr>
+        <w:t xml:space="preserve">Q1.</w:t>
+      </w:r>
+    </w:p>
+    <w:p>
+      <w:r>
+        <w:t xml:space="preserve">[paste the stem screenshot here — this question's equation doesn't type cleanly]</w:t>
+      </w:r>
+    </w:p>
+    <w:p>
+      <w:r>
+        <w:t xml:space="preserve">[A] 1.2 J</w:t>
+      </w:r>
+    </w:p>
+    <w:p>
+      <w:r>
+        <w:t xml:space="preserve">[B] 1.5 J</w:t>
+      </w:r>
+    </w:p>
+    <w:p>
+      <w:r>
+        <w:t xml:space="preserve">[C] 0.8 J</w:t>
+      </w:r>
+    </w:p>
+    <w:p>
+      <w:pPr>
+        <w:spacing w:after="200"/>
+      </w:pPr>
+      <w:r>
+        <w:t xml:space="preserve">[D] 1.0 J</w:t>
+      </w:r>
+    </w:p>
+    <w:p>
+      <w:pPr>
+        <w:pStyle w:val="Heading2"/>
+      </w:pPr>
+      <w:r>
+        <w:t xml:space="preserve">Example — fully typed, no screenshots needed</w:t>
+      </w:r>
+    </w:p>
+    <w:p>
+      <w:pPr>
+        <w:spacing w:before="200"/>
+      </w:pPr>
+      <w:r>
+        <w:rPr>
+          <w:b/>
+          <w:bCs/>
+        </w:rPr>
         <w:t xml:space="preserve">Q2. A ball is dropped from rest. What is its acceleration near Earth’s surface?</w:t>
       </w:r>
     </w:p>
     <w:p>
       <w:r>
-        <w:t xml:space="preserve">A) 0</w:t>
-      </w:r>
-    </w:p>
-    <w:p>
-      <w:r>
-        <w:t xml:space="preserve">B) 9.8</w:t>
-      </w:r>
-    </w:p>
-    <w:p>
-      <w:r>
-        <w:t xml:space="preserve">C) 4.9</w:t>
+        <w:t xml:space="preserve">[A] 0</w:t>
+      </w:r>
+    </w:p>
+    <w:p>
+      <w:r>
+        <w:t xml:space="preserve">[B] 9.8</w:t>
+      </w:r>
+    </w:p>
+    <w:p>
+      <w:r>
+        <w:t xml:space="preserve">[C] 4.9</w:t>
       </w:r>
     </w:p>
     <w:p>
@@ -141,12 +156,12 @@
         <w:spacing w:after="200"/>
       </w:pPr>
       <w:r>
-        <w:t xml:space="preserve">D) 19.6</w:t>
-      </w:r>
-    </w:p>
-    <w:p>
-      <w:r>
-        <w:t xml:space="preserve">Delete these example questions and replace them with your own — keep the same Q&lt;number&gt;./A)/B)/C)/D) marker pattern.</w:t>
+        <w:t xml:space="preserve">[D] 19.6</w:t>
+      </w:r>
+    </w:p>
+    <w:p>
+      <w:r>
+        <w:t xml:space="preserve">Delete these example questions and replace them with your own — keep the same Q&lt;number&gt;./[A]/[B]/[C]/[D] marker pattern.</w:t>
       </w:r>
     </w:p>
     <w:sectPr>

</xml_diff>